<commit_message>
Final factor list, sample report, screening output and summary report
</commit_message>
<xml_diff>
--- a/docs/Summary Report.docx
+++ b/docs/Summary Report.docx
@@ -37,7 +37,7 @@
         <w:t xml:space="preserve"> </w:t>
       </w:r>
       <w:r>
-        <w:t xml:space="preserve">Indicator</w:t>
+        <w:t xml:space="preserve">Factor</w:t>
       </w:r>
       <w:r>
         <w:t xml:space="preserve"> </w:t>
@@ -94,7 +94,7 @@
         <w:pStyle w:val="FirstParagraph"/>
       </w:pPr>
       <w:r>
-        <w:t xml:space="preserve">A command-line workflow that takes a report date and, in one command, downloads seven public macro indicators that lead Singapore home prices and rents, stores the raw downloads as checksummed snapshots, validates and normalises them, computes period changes in the correct unit, and writes a report in which every figure is traced to the published observations behind it.</w:t>
+        <w:t xml:space="preserve">A command-line workflow that takes a report date and, in one command, downloads six public factors that may predict Singapore private home prices and rents, stores the raw downloads as checksummed snapshots, validates them, computes period changes in the correct unit, and writes a report in which every figure is traced to the published observations behind it.</w:t>
       </w:r>
     </w:p>
     <w:p>
@@ -106,7 +106,20 @@
           <w:rStyle w:val="VerbatimChar"/>
           <w:sz w:val="17"/>
         </w:rPr>
-        <w:t xml:space="preserve">python -m housing_agent run --date 2026-10-04</w:t>
+        <w:t xml:space="preserve">python -m housing_agent run --date 2026-10-04           # the report</w:t>
+      </w:r>
+      <w:r>
+        <w:rPr>
+          <w:sz w:val="17"/>
+        </w:rPr>
+        <w:br/>
+      </w:r>
+      <w:r>
+        <w:rPr>
+          <w:rStyle w:val="VerbatimChar"/>
+          <w:sz w:val="17"/>
+        </w:rPr>
+        <w:t xml:space="preserve">python -m housing_agent select-factors --date 2026-10-04  # the evidence behind the factor list</w:t>
       </w:r>
     </w:p>
     <w:p>
@@ -114,17 +127,17 @@
         <w:pStyle w:val="FirstParagraph"/>
       </w:pPr>
       <w:r>
-        <w:t xml:space="preserve">No forecasting model is trained. I treated the task as two questions: which few series are worth watching and why, and how to make the path from the publisher to the report reliable and reproducible. The repository contains the code, 22 tests that run without network, the raw snapshots from a live run on 4 October 2026, and the report that run produced.</w:t>
+        <w:t xml:space="preserve">No forecasting model is trained. I treated the task as two questions: which few series are worth watching and on what evidence, and how to make the path from the publisher to the report reliable and reproducible. The repository contains the code, 33 tests that run without network, the raw snapshots from a live run on 4 October 2026, the report that run produced, and the factor screening output.</w:t>
       </w:r>
     </w:p>
     <w:bookmarkEnd w:id="20"/>
-    <w:bookmarkStart w:id="21" w:name="indicator-selection"/>
+    <w:bookmarkStart w:id="21" w:name="factor-selection"/>
     <w:p>
       <w:pPr>
         <w:pStyle w:val="Heading1"/>
       </w:pPr>
       <w:r>
-        <w:t xml:space="preserve">2. Indicator selection</w:t>
+        <w:t xml:space="preserve">2. Factor selection</w:t>
       </w:r>
     </w:p>
     <w:p>
@@ -132,7 +145,75 @@
         <w:pStyle w:val="FirstParagraph"/>
       </w:pPr>
       <w:r>
-        <w:t xml:space="preserve">I chose indicators by asking what moves demand for housing, what moves the cost of financing it, and what moves supply, and then kept one or two series per channel. I preferred series that are official, published on a fixed schedule, available through a documented API, and long enough to compare with a year earlier. Sale and rental markets are read separately because some indicators affect them differently.</w:t>
+        <w:t xml:space="preserve">I started from economic reasoning: housing is moved by financing cost, by demand (income, employment, population) and by supply. That gave a pool of 16 candidate series, all official, published on a fixed schedule and available through one documented API. I then screened the pool against the URA private price and rental indices instead of relying on the reasoning alone.</w:t>
+      </w:r>
+    </w:p>
+    <w:p>
+      <w:pPr>
+        <w:pStyle w:val="BodyText"/>
+      </w:pPr>
+      <w:r>
+        <w:rPr>
+          <w:bCs/>
+          <w:b/>
+        </w:rPr>
+        <w:t xml:space="preserve">Method.</w:t>
+      </w:r>
+      <w:r>
+        <w:t xml:space="preserve"> </w:t>
+      </w:r>
+      <w:r>
+        <w:t xml:space="preserve">For each factor, target and horizon h of 1, 2, 4 and 8 quarters, two regressions were specified before looking at results. The</w:t>
+      </w:r>
+      <w:r>
+        <w:t xml:space="preserve"> </w:t>
+      </w:r>
+      <w:r>
+        <w:rPr>
+          <w:iCs/>
+          <w:i/>
+        </w:rPr>
+        <w:t xml:space="preserve">lead test</w:t>
+      </w:r>
+      <w:r>
+        <w:t xml:space="preserve"> </w:t>
+      </w:r>
+      <w:r>
+        <w:t xml:space="preserve">regresses the cumulative h-quarter change in the target on the factor. The</w:t>
+      </w:r>
+      <w:r>
+        <w:t xml:space="preserve"> </w:t>
+      </w:r>
+      <w:r>
+        <w:rPr>
+          <w:iCs/>
+          <w:i/>
+        </w:rPr>
+        <w:t xml:space="preserve">strict test</w:t>
+      </w:r>
+      <w:r>
+        <w:t xml:space="preserve"> </w:t>
+      </w:r>
+      <w:r>
+        <w:t xml:space="preserve">adds the target’s own past growth, with the autoregressive order chosen by BIC, so it asks whether the factor adds anything beyond momentum (the idea behind a Granger causality test). Factors are made stationary by four-quarter log changes (levels) or differences (rates). Standard errors are Newey-West, because overlapping horizons make the errors serially correlated. With about 60 tests per target, significance is judged after Benjamini-Hochberg control of the false discovery rate at 10%. A factor passes only if its sign is the same in both halves of the sample and it is not a near-duplicate (correlation above 0.8) of a stronger passing factor.</w:t>
+      </w:r>
+    </w:p>
+    <w:p>
+      <w:pPr>
+        <w:pStyle w:val="BodyText"/>
+      </w:pPr>
+      <w:r>
+        <w:rPr>
+          <w:bCs/>
+          <w:b/>
+        </w:rPr>
+        <w:t xml:space="preserve">Results.</w:t>
+      </w:r>
+      <w:r>
+        <w:t xml:space="preserve"> </w:t>
+      </w:r>
+      <w:r>
+        <w:t xml:space="preserve">Samples run from 75 to 201 quarters. All t-statistics below are at a one-quarter horizon.</w:t>
       </w:r>
     </w:p>
     <w:tbl>
@@ -151,12 +232,10 @@
         </w:tblBorders>
       </w:tblPr>
       <w:tblGrid>
-        <w:gridCol w:w="1827"/>
-        <w:gridCol w:w="1015"/>
-        <w:gridCol w:w="812"/>
-        <w:gridCol w:w="609"/>
-        <w:gridCol w:w="609"/>
-        <w:gridCol w:w="3046"/>
+        <w:gridCol w:w="1584"/>
+        <w:gridCol w:w="2640"/>
+        <w:gridCol w:w="2640"/>
+        <w:gridCol w:w="1056"/>
       </w:tblGrid>
       <w:tr>
         <w:trPr>
@@ -175,7 +254,7 @@
                 <w:b/>
                 <w:sz w:val="18"/>
               </w:rPr>
-              <w:t xml:space="preserve">Indicator (publisher)</w:t>
+              <w:t xml:space="preserve">Factor</w:t>
             </w:r>
           </w:p>
         </w:tc>
@@ -192,7 +271,7 @@
                 <w:b/>
                 <w:sz w:val="18"/>
               </w:rPr>
-              <w:t xml:space="preserve">Observed</w:t>
+              <w:t xml:space="preserve">Sale prices</w:t>
             </w:r>
           </w:p>
         </w:tc>
@@ -209,7 +288,7 @@
                 <w:b/>
                 <w:sz w:val="18"/>
               </w:rPr>
-              <w:t xml:space="preserve">Change in</w:t>
+              <w:t xml:space="preserve">Rents</w:t>
             </w:r>
           </w:p>
         </w:tc>
@@ -226,41 +305,7 @@
                 <w:b/>
                 <w:sz w:val="18"/>
               </w:rPr>
-              <w:t xml:space="preserve">Sale</w:t>
-            </w:r>
-          </w:p>
-        </w:tc>
-        <w:tc>
-          <w:tcPr/>
-          <w:p>
-            <w:pPr>
-              <w:pStyle w:val="Compact"/>
-              <w:spacing w:after="20"/>
-              <w:jc w:val="left"/>
-            </w:pPr>
-            <w:r>
-              <w:rPr>
-                <w:b/>
-                <w:sz w:val="18"/>
-              </w:rPr>
-              <w:t xml:space="preserve">Rent</w:t>
-            </w:r>
-          </w:p>
-        </w:tc>
-        <w:tc>
-          <w:tcPr/>
-          <w:p>
-            <w:pPr>
-              <w:pStyle w:val="Compact"/>
-              <w:spacing w:after="20"/>
-              <w:jc w:val="left"/>
-            </w:pPr>
-            <w:r>
-              <w:rPr>
-                <w:b/>
-                <w:sz w:val="18"/>
-              </w:rPr>
-              <w:t xml:space="preserve">Reason for inclusion</w:t>
+              <w:t xml:space="preserve">Sign as expected</w:t>
             </w:r>
           </w:p>
         </w:tc>
@@ -278,87 +323,69 @@
               <w:rPr>
                 <w:sz w:val="18"/>
               </w:rPr>
-              <w:t xml:space="preserve">3-month compounded SORA (MAS)</w:t>
-            </w:r>
-          </w:p>
-        </w:tc>
-        <w:tc>
-          <w:tcPr/>
-          <w:p>
-            <w:pPr>
-              <w:pStyle w:val="Compact"/>
-              <w:spacing w:after="20"/>
-              <w:jc w:val="left"/>
-            </w:pPr>
-            <w:r>
-              <w:rPr>
-                <w:sz w:val="18"/>
-              </w:rPr>
-              <w:t xml:space="preserve">Monthly</w:t>
-            </w:r>
-          </w:p>
-        </w:tc>
-        <w:tc>
-          <w:tcPr/>
-          <w:p>
-            <w:pPr>
-              <w:pStyle w:val="Compact"/>
-              <w:spacing w:after="20"/>
-              <w:jc w:val="left"/>
-            </w:pPr>
-            <w:r>
-              <w:rPr>
-                <w:sz w:val="18"/>
-              </w:rPr>
-              <w:t xml:space="preserve">bp</w:t>
-            </w:r>
-          </w:p>
-        </w:tc>
-        <w:tc>
-          <w:tcPr/>
-          <w:p>
-            <w:pPr>
-              <w:pStyle w:val="Compact"/>
-              <w:spacing w:after="20"/>
-              <w:jc w:val="left"/>
-            </w:pPr>
-            <w:r>
-              <w:rPr>
-                <w:sz w:val="18"/>
-              </w:rPr>
-              <w:t xml:space="preserve">−</w:t>
-            </w:r>
-          </w:p>
-        </w:tc>
-        <w:tc>
-          <w:tcPr/>
-          <w:p>
-            <w:pPr>
-              <w:pStyle w:val="Compact"/>
-              <w:spacing w:after="20"/>
-              <w:jc w:val="left"/>
-            </w:pPr>
-            <w:r>
-              <w:rPr>
-                <w:sz w:val="18"/>
-              </w:rPr>
-              <w:t xml:space="preserve">n/u</w:t>
-            </w:r>
-          </w:p>
-        </w:tc>
-        <w:tc>
-          <w:tcPr/>
-          <w:p>
-            <w:pPr>
-              <w:pStyle w:val="Compact"/>
-              <w:spacing w:after="20"/>
-              <w:jc w:val="left"/>
-            </w:pPr>
-            <w:r>
-              <w:rPr>
-                <w:sz w:val="18"/>
-              </w:rPr>
-              <w:t xml:space="preserve">Reference rate for most floating-rate home loans; sets instalments and borrowing capacity under the TDSR</w:t>
+              <w:t xml:space="preserve">Private vacancy rate</w:t>
+            </w:r>
+          </w:p>
+        </w:tc>
+        <w:tc>
+          <w:tcPr/>
+          <w:p>
+            <w:pPr>
+              <w:pStyle w:val="Compact"/>
+              <w:spacing w:after="20"/>
+              <w:jc w:val="left"/>
+            </w:pPr>
+            <w:r>
+              <w:rPr>
+                <w:sz w:val="18"/>
+              </w:rPr>
+              <w:t xml:space="preserve">lead (t = −2.82)</w:t>
+            </w:r>
+          </w:p>
+        </w:tc>
+        <w:tc>
+          <w:tcPr/>
+          <w:p>
+            <w:pPr>
+              <w:pStyle w:val="Compact"/>
+              <w:spacing w:after="20"/>
+              <w:jc w:val="left"/>
+            </w:pPr>
+            <w:r>
+              <w:rPr>
+                <w:bCs/>
+                <w:b/>
+                <w:sz w:val="18"/>
+              </w:rPr>
+              <w:t xml:space="preserve">strict</w:t>
+            </w:r>
+            <w:r>
+              <w:rPr>
+                <w:sz w:val="18"/>
+              </w:rPr>
+              <w:t xml:space="preserve"> </w:t>
+            </w:r>
+            <w:r>
+              <w:rPr>
+                <w:sz w:val="18"/>
+              </w:rPr>
+              <w:t xml:space="preserve">(t = −3.70 change, −2.57 level)</w:t>
+            </w:r>
+          </w:p>
+        </w:tc>
+        <w:tc>
+          <w:tcPr/>
+          <w:p>
+            <w:pPr>
+              <w:pStyle w:val="Compact"/>
+              <w:spacing w:after="20"/>
+              <w:jc w:val="left"/>
+            </w:pPr>
+            <w:r>
+              <w:rPr>
+                <w:sz w:val="18"/>
+              </w:rPr>
+              <w:t xml:space="preserve">yes</w:t>
             </w:r>
           </w:p>
         </w:tc>
@@ -376,87 +403,69 @@
               <w:rPr>
                 <w:sz w:val="18"/>
               </w:rPr>
-              <w:t xml:space="preserve">CPI, All Items (DOS)</w:t>
-            </w:r>
-          </w:p>
-        </w:tc>
-        <w:tc>
-          <w:tcPr/>
-          <w:p>
-            <w:pPr>
-              <w:pStyle w:val="Compact"/>
-              <w:spacing w:after="20"/>
-              <w:jc w:val="left"/>
-            </w:pPr>
-            <w:r>
-              <w:rPr>
-                <w:sz w:val="18"/>
-              </w:rPr>
-              <w:t xml:space="preserve">Monthly</w:t>
-            </w:r>
-          </w:p>
-        </w:tc>
-        <w:tc>
-          <w:tcPr/>
-          <w:p>
-            <w:pPr>
-              <w:pStyle w:val="Compact"/>
-              <w:spacing w:after="20"/>
-              <w:jc w:val="left"/>
-            </w:pPr>
-            <w:r>
-              <w:rPr>
-                <w:sz w:val="18"/>
-              </w:rPr>
-              <w:t xml:space="preserve">%</w:t>
-            </w:r>
-          </w:p>
-        </w:tc>
-        <w:tc>
-          <w:tcPr/>
-          <w:p>
-            <w:pPr>
-              <w:pStyle w:val="Compact"/>
-              <w:spacing w:after="20"/>
-              <w:jc w:val="left"/>
-            </w:pPr>
-            <w:r>
-              <w:rPr>
-                <w:sz w:val="18"/>
-              </w:rPr>
-              <w:t xml:space="preserve">+</w:t>
-            </w:r>
-          </w:p>
-        </w:tc>
-        <w:tc>
-          <w:tcPr/>
-          <w:p>
-            <w:pPr>
-              <w:pStyle w:val="Compact"/>
-              <w:spacing w:after="20"/>
-              <w:jc w:val="left"/>
-            </w:pPr>
-            <w:r>
-              <w:rPr>
-                <w:sz w:val="18"/>
-              </w:rPr>
-              <w:t xml:space="preserve">+</w:t>
-            </w:r>
-          </w:p>
-        </w:tc>
-        <w:tc>
-          <w:tcPr/>
-          <w:p>
-            <w:pPr>
-              <w:pStyle w:val="Compact"/>
-              <w:spacing w:after="20"/>
-              <w:jc w:val="left"/>
-            </w:pPr>
-            <w:r>
-              <w:rPr>
-                <w:sz w:val="18"/>
-              </w:rPr>
-              <w:t xml:space="preserve">Nominal anchor for rents and building costs; the variable MAS policy responds to</w:t>
+              <w:t xml:space="preserve">Nominal GDP</w:t>
+            </w:r>
+          </w:p>
+        </w:tc>
+        <w:tc>
+          <w:tcPr/>
+          <w:p>
+            <w:pPr>
+              <w:pStyle w:val="Compact"/>
+              <w:spacing w:after="20"/>
+              <w:jc w:val="left"/>
+            </w:pPr>
+            <w:r>
+              <w:rPr>
+                <w:sz w:val="18"/>
+              </w:rPr>
+              <w:t xml:space="preserve">lead (t = +3.16)*</w:t>
+            </w:r>
+          </w:p>
+        </w:tc>
+        <w:tc>
+          <w:tcPr/>
+          <w:p>
+            <w:pPr>
+              <w:pStyle w:val="Compact"/>
+              <w:spacing w:after="20"/>
+              <w:jc w:val="left"/>
+            </w:pPr>
+            <w:r>
+              <w:rPr>
+                <w:bCs/>
+                <w:b/>
+                <w:sz w:val="18"/>
+              </w:rPr>
+              <w:t xml:space="preserve">strict</w:t>
+            </w:r>
+            <w:r>
+              <w:rPr>
+                <w:sz w:val="18"/>
+              </w:rPr>
+              <w:t xml:space="preserve"> </w:t>
+            </w:r>
+            <w:r>
+              <w:rPr>
+                <w:sz w:val="18"/>
+              </w:rPr>
+              <w:t xml:space="preserve">(t = +3.02)</w:t>
+            </w:r>
+          </w:p>
+        </w:tc>
+        <w:tc>
+          <w:tcPr/>
+          <w:p>
+            <w:pPr>
+              <w:pStyle w:val="Compact"/>
+              <w:spacing w:after="20"/>
+              <w:jc w:val="left"/>
+            </w:pPr>
+            <w:r>
+              <w:rPr>
+                <w:sz w:val="18"/>
+              </w:rPr>
+              <w:t xml:space="preserve">yes</w:t>
             </w:r>
           </w:p>
         </w:tc>
@@ -474,87 +483,55 @@
               <w:rPr>
                 <w:sz w:val="18"/>
               </w:rPr>
-              <w:t xml:space="preserve">Nominal GDP (DOS)</w:t>
-            </w:r>
-          </w:p>
-        </w:tc>
-        <w:tc>
-          <w:tcPr/>
-          <w:p>
-            <w:pPr>
-              <w:pStyle w:val="Compact"/>
-              <w:spacing w:after="20"/>
-              <w:jc w:val="left"/>
-            </w:pPr>
-            <w:r>
-              <w:rPr>
-                <w:sz w:val="18"/>
-              </w:rPr>
-              <w:t xml:space="preserve">Quarterly</w:t>
-            </w:r>
-          </w:p>
-        </w:tc>
-        <w:tc>
-          <w:tcPr/>
-          <w:p>
-            <w:pPr>
-              <w:pStyle w:val="Compact"/>
-              <w:spacing w:after="20"/>
-              <w:jc w:val="left"/>
-            </w:pPr>
-            <w:r>
-              <w:rPr>
-                <w:sz w:val="18"/>
-              </w:rPr>
-              <w:t xml:space="preserve">% y/y</w:t>
-            </w:r>
-          </w:p>
-        </w:tc>
-        <w:tc>
-          <w:tcPr/>
-          <w:p>
-            <w:pPr>
-              <w:pStyle w:val="Compact"/>
-              <w:spacing w:after="20"/>
-              <w:jc w:val="left"/>
-            </w:pPr>
-            <w:r>
-              <w:rPr>
-                <w:sz w:val="18"/>
-              </w:rPr>
-              <w:t xml:space="preserve">+</w:t>
-            </w:r>
-          </w:p>
-        </w:tc>
-        <w:tc>
-          <w:tcPr/>
-          <w:p>
-            <w:pPr>
-              <w:pStyle w:val="Compact"/>
-              <w:spacing w:after="20"/>
-              <w:jc w:val="left"/>
-            </w:pPr>
-            <w:r>
-              <w:rPr>
-                <w:sz w:val="18"/>
-              </w:rPr>
-              <w:t xml:space="preserve">+</w:t>
-            </w:r>
-          </w:p>
-        </w:tc>
-        <w:tc>
-          <w:tcPr/>
-          <w:p>
-            <w:pPr>
-              <w:pStyle w:val="Compact"/>
-              <w:spacing w:after="20"/>
-              <w:jc w:val="left"/>
-            </w:pPr>
-            <w:r>
-              <w:rPr>
-                <w:sz w:val="18"/>
-              </w:rPr>
-              <w:t xml:space="preserve">Income growth; corporate demand for expatriate housing</w:t>
+              <w:t xml:space="preserve">HDB resale price index</w:t>
+            </w:r>
+          </w:p>
+        </w:tc>
+        <w:tc>
+          <w:tcPr/>
+          <w:p>
+            <w:pPr>
+              <w:pStyle w:val="Compact"/>
+              <w:spacing w:after="20"/>
+              <w:jc w:val="left"/>
+            </w:pPr>
+            <w:r>
+              <w:rPr>
+                <w:sz w:val="18"/>
+              </w:rPr>
+              <w:t xml:space="preserve">lead (t = +2.52)</w:t>
+            </w:r>
+          </w:p>
+        </w:tc>
+        <w:tc>
+          <w:tcPr/>
+          <w:p>
+            <w:pPr>
+              <w:pStyle w:val="Compact"/>
+              <w:spacing w:after="20"/>
+              <w:jc w:val="left"/>
+            </w:pPr>
+            <w:r>
+              <w:rPr>
+                <w:sz w:val="18"/>
+              </w:rPr>
+              <w:t xml:space="preserve">none</w:t>
+            </w:r>
+          </w:p>
+        </w:tc>
+        <w:tc>
+          <w:tcPr/>
+          <w:p>
+            <w:pPr>
+              <w:pStyle w:val="Compact"/>
+              <w:spacing w:after="20"/>
+              <w:jc w:val="left"/>
+            </w:pPr>
+            <w:r>
+              <w:rPr>
+                <w:sz w:val="18"/>
+              </w:rPr>
+              <w:t xml:space="preserve">yes</w:t>
             </w:r>
           </w:p>
         </w:tc>
@@ -572,87 +549,55 @@
               <w:rPr>
                 <w:sz w:val="18"/>
               </w:rPr>
-              <w:t xml:space="preserve">Resident unemployment rate, SA (MOM)</w:t>
-            </w:r>
-          </w:p>
-        </w:tc>
-        <w:tc>
-          <w:tcPr/>
-          <w:p>
-            <w:pPr>
-              <w:pStyle w:val="Compact"/>
-              <w:spacing w:after="20"/>
-              <w:jc w:val="left"/>
-            </w:pPr>
-            <w:r>
-              <w:rPr>
-                <w:sz w:val="18"/>
-              </w:rPr>
-              <w:t xml:space="preserve">Quarterly</w:t>
-            </w:r>
-          </w:p>
-        </w:tc>
-        <w:tc>
-          <w:tcPr/>
-          <w:p>
-            <w:pPr>
-              <w:pStyle w:val="Compact"/>
-              <w:spacing w:after="20"/>
-              <w:jc w:val="left"/>
-            </w:pPr>
-            <w:r>
-              <w:rPr>
-                <w:sz w:val="18"/>
-              </w:rPr>
-              <w:t xml:space="preserve">pp</w:t>
-            </w:r>
-          </w:p>
-        </w:tc>
-        <w:tc>
-          <w:tcPr/>
-          <w:p>
-            <w:pPr>
-              <w:pStyle w:val="Compact"/>
-              <w:spacing w:after="20"/>
-              <w:jc w:val="left"/>
-            </w:pPr>
-            <w:r>
-              <w:rPr>
-                <w:sz w:val="18"/>
-              </w:rPr>
-              <w:t xml:space="preserve">−</w:t>
-            </w:r>
-          </w:p>
-        </w:tc>
-        <w:tc>
-          <w:tcPr/>
-          <w:p>
-            <w:pPr>
-              <w:pStyle w:val="Compact"/>
-              <w:spacing w:after="20"/>
-              <w:jc w:val="left"/>
-            </w:pPr>
-            <w:r>
-              <w:rPr>
-                <w:sz w:val="18"/>
-              </w:rPr>
-              <w:t xml:space="preserve">−</w:t>
-            </w:r>
-          </w:p>
-        </w:tc>
-        <w:tc>
-          <w:tcPr/>
-          <w:p>
-            <w:pPr>
-              <w:pStyle w:val="Compact"/>
-              <w:spacing w:after="20"/>
-              <w:jc w:val="left"/>
-            </w:pPr>
-            <w:r>
-              <w:rPr>
-                <w:sz w:val="18"/>
-              </w:rPr>
-              <w:t xml:space="preserve">Income security of the households that buy</w:t>
+              <w:t xml:space="preserve">Resident unemployment rate</w:t>
+            </w:r>
+          </w:p>
+        </w:tc>
+        <w:tc>
+          <w:tcPr/>
+          <w:p>
+            <w:pPr>
+              <w:pStyle w:val="Compact"/>
+              <w:spacing w:after="20"/>
+              <w:jc w:val="left"/>
+            </w:pPr>
+            <w:r>
+              <w:rPr>
+                <w:sz w:val="18"/>
+              </w:rPr>
+              <w:t xml:space="preserve">none</w:t>
+            </w:r>
+          </w:p>
+        </w:tc>
+        <w:tc>
+          <w:tcPr/>
+          <w:p>
+            <w:pPr>
+              <w:pStyle w:val="Compact"/>
+              <w:spacing w:after="20"/>
+              <w:jc w:val="left"/>
+            </w:pPr>
+            <w:r>
+              <w:rPr>
+                <w:sz w:val="18"/>
+              </w:rPr>
+              <w:t xml:space="preserve">lead (t = −3.44)</w:t>
+            </w:r>
+          </w:p>
+        </w:tc>
+        <w:tc>
+          <w:tcPr/>
+          <w:p>
+            <w:pPr>
+              <w:pStyle w:val="Compact"/>
+              <w:spacing w:after="20"/>
+              <w:jc w:val="left"/>
+            </w:pPr>
+            <w:r>
+              <w:rPr>
+                <w:sz w:val="18"/>
+              </w:rPr>
+              <w:t xml:space="preserve">yes</w:t>
             </w:r>
           </w:p>
         </w:tc>
@@ -670,87 +615,57 @@
               <w:rPr>
                 <w:sz w:val="18"/>
               </w:rPr>
-              <w:t xml:space="preserve">Total population (DOS)</w:t>
-            </w:r>
-          </w:p>
-        </w:tc>
-        <w:tc>
-          <w:tcPr/>
-          <w:p>
-            <w:pPr>
-              <w:pStyle w:val="Compact"/>
-              <w:spacing w:after="20"/>
-              <w:jc w:val="left"/>
-            </w:pPr>
-            <w:r>
-              <w:rPr>
-                <w:sz w:val="18"/>
-              </w:rPr>
-              <w:t xml:space="preserve">Annual</w:t>
-            </w:r>
-          </w:p>
-        </w:tc>
-        <w:tc>
-          <w:tcPr/>
-          <w:p>
-            <w:pPr>
-              <w:pStyle w:val="Compact"/>
-              <w:spacing w:after="20"/>
-              <w:jc w:val="left"/>
-            </w:pPr>
-            <w:r>
-              <w:rPr>
-                <w:sz w:val="18"/>
-              </w:rPr>
-              <w:t xml:space="preserve">%</w:t>
-            </w:r>
-          </w:p>
-        </w:tc>
-        <w:tc>
-          <w:tcPr/>
-          <w:p>
-            <w:pPr>
-              <w:pStyle w:val="Compact"/>
-              <w:spacing w:after="20"/>
-              <w:jc w:val="left"/>
-            </w:pPr>
-            <w:r>
-              <w:rPr>
-                <w:sz w:val="18"/>
-              </w:rPr>
-              <w:t xml:space="preserve">+</w:t>
-            </w:r>
-          </w:p>
-        </w:tc>
-        <w:tc>
-          <w:tcPr/>
-          <w:p>
-            <w:pPr>
-              <w:pStyle w:val="Compact"/>
-              <w:spacing w:after="20"/>
-              <w:jc w:val="left"/>
-            </w:pPr>
-            <w:r>
-              <w:rPr>
-                <w:sz w:val="18"/>
-              </w:rPr>
-              <w:t xml:space="preserve">+</w:t>
-            </w:r>
-          </w:p>
-        </w:tc>
-        <w:tc>
-          <w:tcPr/>
-          <w:p>
-            <w:pPr>
-              <w:pStyle w:val="Compact"/>
-              <w:spacing w:after="20"/>
-              <w:jc w:val="left"/>
-            </w:pPr>
-            <w:r>
-              <w:rPr>
-                <w:sz w:val="18"/>
-              </w:rPr>
-              <w:t xml:space="preserve">Basic demand; variation is mostly non-residents, who rent</w:t>
+              <w:t xml:space="preserve">Private supply pipeline</w:t>
+            </w:r>
+          </w:p>
+        </w:tc>
+        <w:tc>
+          <w:tcPr/>
+          <w:p>
+            <w:pPr>
+              <w:pStyle w:val="Compact"/>
+              <w:spacing w:after="20"/>
+              <w:jc w:val="left"/>
+            </w:pPr>
+            <w:r>
+              <w:rPr>
+                <w:sz w:val="18"/>
+              </w:rPr>
+              <w:t xml:space="preserve">lead (t = +2.49)</w:t>
+            </w:r>
+          </w:p>
+        </w:tc>
+        <w:tc>
+          <w:tcPr/>
+          <w:p>
+            <w:pPr>
+              <w:pStyle w:val="Compact"/>
+              <w:spacing w:after="20"/>
+              <w:jc w:val="left"/>
+            </w:pPr>
+            <w:r>
+              <w:rPr>
+                <w:sz w:val="18"/>
+              </w:rPr>
+              <w:t xml:space="preserve">lead (t = +3.05)</w:t>
+            </w:r>
+          </w:p>
+        </w:tc>
+        <w:tc>
+          <w:tcPr/>
+          <w:p>
+            <w:pPr>
+              <w:pStyle w:val="Compact"/>
+              <w:spacing w:after="20"/>
+              <w:jc w:val="left"/>
+            </w:pPr>
+            <w:r>
+              <w:rPr>
+                <w:bCs/>
+                <w:b/>
+                <w:sz w:val="18"/>
+              </w:rPr>
+              <w:t xml:space="preserve">no</w:t>
             </w:r>
           </w:p>
         </w:tc>
@@ -768,186 +683,49 @@
               <w:rPr>
                 <w:sz w:val="18"/>
               </w:rPr>
-              <w:t xml:space="preserve">Private non-landed supply pipeline (URA)</w:t>
-            </w:r>
-          </w:p>
-        </w:tc>
-        <w:tc>
-          <w:tcPr/>
-          <w:p>
-            <w:pPr>
-              <w:pStyle w:val="Compact"/>
-              <w:spacing w:after="20"/>
-              <w:jc w:val="left"/>
-            </w:pPr>
-            <w:r>
-              <w:rPr>
-                <w:sz w:val="18"/>
-              </w:rPr>
-              <w:t xml:space="preserve">Quarterly</w:t>
-            </w:r>
-          </w:p>
-        </w:tc>
-        <w:tc>
-          <w:tcPr/>
-          <w:p>
-            <w:pPr>
-              <w:pStyle w:val="Compact"/>
-              <w:spacing w:after="20"/>
-              <w:jc w:val="left"/>
-            </w:pPr>
-            <w:r>
-              <w:rPr>
-                <w:sz w:val="18"/>
-              </w:rPr>
-              <w:t xml:space="preserve">%</w:t>
-            </w:r>
-          </w:p>
-        </w:tc>
-        <w:tc>
-          <w:tcPr/>
-          <w:p>
-            <w:pPr>
-              <w:pStyle w:val="Compact"/>
-              <w:spacing w:after="20"/>
-              <w:jc w:val="left"/>
-            </w:pPr>
-            <w:r>
-              <w:rPr>
-                <w:sz w:val="18"/>
-              </w:rPr>
-              <w:t xml:space="preserve">−</w:t>
-            </w:r>
-          </w:p>
-        </w:tc>
-        <w:tc>
-          <w:tcPr/>
-          <w:p>
-            <w:pPr>
-              <w:pStyle w:val="Compact"/>
-              <w:spacing w:after="20"/>
-              <w:jc w:val="left"/>
-            </w:pPr>
-            <w:r>
-              <w:rPr>
-                <w:sz w:val="18"/>
-              </w:rPr>
-              <w:t xml:space="preserve">−</w:t>
-            </w:r>
-          </w:p>
-        </w:tc>
-        <w:tc>
-          <w:tcPr/>
-          <w:p>
-            <w:pPr>
-              <w:pStyle w:val="Compact"/>
-              <w:spacing w:after="20"/>
-              <w:jc w:val="left"/>
-            </w:pPr>
-            <w:r>
-              <w:rPr>
-                <w:sz w:val="18"/>
-              </w:rPr>
-              <w:t xml:space="preserve">Completions two to four years ahead</w:t>
-            </w:r>
-          </w:p>
-        </w:tc>
-      </w:tr>
-      <w:tr>
-        <w:tc>
-          <w:tcPr/>
-          <w:p>
-            <w:pPr>
-              <w:pStyle w:val="Compact"/>
-              <w:spacing w:after="20"/>
-              <w:jc w:val="left"/>
-            </w:pPr>
-            <w:r>
-              <w:rPr>
-                <w:sz w:val="18"/>
-              </w:rPr>
-              <w:t xml:space="preserve">Private residential vacancy rate (derived, URA)</w:t>
-            </w:r>
-          </w:p>
-        </w:tc>
-        <w:tc>
-          <w:tcPr/>
-          <w:p>
-            <w:pPr>
-              <w:pStyle w:val="Compact"/>
-              <w:spacing w:after="20"/>
-              <w:jc w:val="left"/>
-            </w:pPr>
-            <w:r>
-              <w:rPr>
-                <w:sz w:val="18"/>
-              </w:rPr>
-              <w:t xml:space="preserve">Quarterly</w:t>
-            </w:r>
-          </w:p>
-        </w:tc>
-        <w:tc>
-          <w:tcPr/>
-          <w:p>
-            <w:pPr>
-              <w:pStyle w:val="Compact"/>
-              <w:spacing w:after="20"/>
-              <w:jc w:val="left"/>
-            </w:pPr>
-            <w:r>
-              <w:rPr>
-                <w:sz w:val="18"/>
-              </w:rPr>
-              <w:t xml:space="preserve">pp</w:t>
-            </w:r>
-          </w:p>
-        </w:tc>
-        <w:tc>
-          <w:tcPr/>
-          <w:p>
-            <w:pPr>
-              <w:pStyle w:val="Compact"/>
-              <w:spacing w:after="20"/>
-              <w:jc w:val="left"/>
-            </w:pPr>
-            <w:r>
-              <w:rPr>
-                <w:sz w:val="18"/>
-              </w:rPr>
-              <w:t xml:space="preserve">−</w:t>
-            </w:r>
-          </w:p>
-        </w:tc>
-        <w:tc>
-          <w:tcPr/>
-          <w:p>
-            <w:pPr>
-              <w:pStyle w:val="Compact"/>
-              <w:spacing w:after="20"/>
-              <w:jc w:val="left"/>
-            </w:pPr>
-            <w:r>
-              <w:rPr>
-                <w:sz w:val="18"/>
-              </w:rPr>
-              <w:t xml:space="preserve">−</w:t>
-            </w:r>
-          </w:p>
-        </w:tc>
-        <w:tc>
-          <w:tcPr/>
-          <w:p>
-            <w:pPr>
-              <w:pStyle w:val="Compact"/>
-              <w:spacing w:after="20"/>
-              <w:jc w:val="left"/>
-            </w:pPr>
-            <w:r>
-              <w:rPr>
-                <w:sz w:val="18"/>
-              </w:rPr>
-              <w:t xml:space="preserve">Slack in existing stock; most direct rental signal</w:t>
-            </w:r>
+              <w:t xml:space="preserve">3-month SORA, CPI, population, bond yields</w:t>
+            </w:r>
+          </w:p>
+        </w:tc>
+        <w:tc>
+          <w:tcPr/>
+          <w:p>
+            <w:pPr>
+              <w:pStyle w:val="Compact"/>
+              <w:spacing w:after="20"/>
+              <w:jc w:val="left"/>
+            </w:pPr>
+            <w:r>
+              <w:rPr>
+                <w:sz w:val="18"/>
+              </w:rPr>
+              <w:t xml:space="preserve">none</w:t>
+            </w:r>
+          </w:p>
+        </w:tc>
+        <w:tc>
+          <w:tcPr/>
+          <w:p>
+            <w:pPr>
+              <w:pStyle w:val="Compact"/>
+              <w:spacing w:after="20"/>
+              <w:jc w:val="left"/>
+            </w:pPr>
+            <w:r>
+              <w:rPr>
+                <w:sz w:val="18"/>
+              </w:rPr>
+              <w:t xml:space="preserve">none</w:t>
+            </w:r>
+          </w:p>
+        </w:tc>
+        <w:tc>
+          <w:tcPr/>
+          <w:p>
+            <w:pPr>
+              <w:pStyle w:val="Compact"/>
+              <w:spacing w:after="20"/>
+            </w:pPr>
           </w:p>
         </w:tc>
       </w:tr>
@@ -957,25 +735,15 @@
         <w:pStyle w:val="BodyText"/>
       </w:pPr>
       <w:r>
-        <w:t xml:space="preserve">The sign is the expected pressure when the indicator rises;</w:t>
-      </w:r>
-      <w:r>
-        <w:t xml:space="preserve"> </w:t>
-      </w:r>
-      <w:r>
-        <w:t xml:space="preserve">“</w:t>
-      </w:r>
-      <w:r>
-        <w:t xml:space="preserve">n/u</w:t>
-      </w:r>
-      <w:r>
-        <w:t xml:space="preserve">”</w:t>
-      </w:r>
-      <w:r>
-        <w:t xml:space="preserve"> </w:t>
-      </w:r>
-      <w:r>
-        <w:t xml:space="preserve">means not used. Three judgements are worth stating:</w:t>
+        <w:t xml:space="preserve">* Significant on its own; the screening keeps real GDP (t = +3.54) as the stronger of two near-collinear series.</w:t>
+      </w:r>
+    </w:p>
+    <w:p>
+      <w:pPr>
+        <w:pStyle w:val="BodyText"/>
+      </w:pPr>
+      <w:r>
+        <w:t xml:space="preserve">Three findings shaped the final list.</w:t>
       </w:r>
     </w:p>
     <w:p>
@@ -991,13 +759,13 @@
           <w:bCs/>
           <w:b/>
         </w:rPr>
-        <w:t xml:space="preserve">SORA is not used for rents.</w:t>
-      </w:r>
-      <w:r>
-        <w:t xml:space="preserve"> </w:t>
-      </w:r>
-      <w:r>
-        <w:t xml:space="preserve">Cheaper mortgages pull tenants into buying, which lowers rental demand, but they also lower landlords’ costs. The net sign is unclear, so I left it out rather than assert one.</w:t>
+        <w:t xml:space="preserve">Rents are more predictable than sale prices.</w:t>
+      </w:r>
+      <w:r>
+        <w:t xml:space="preserve"> </w:t>
+      </w:r>
+      <w:r>
+        <w:t xml:space="preserve">Three factors pass the strict test for rents; none does for sale prices, where four pass the lead test only. Sale prices have strong momentum and are moved by cooling measures that no macro series captures. As a check, the first three principal components of the pool were tested the same way: the second component passes the strict test for sale prices (p = 0.012), so the macro environment as a whole carries information that single series do not.</w:t>
       </w:r>
     </w:p>
     <w:p>
@@ -1013,13 +781,13 @@
           <w:bCs/>
           <w:b/>
         </w:rPr>
-        <w:t xml:space="preserve">GDP is read year-on-year only.</w:t>
-      </w:r>
-      <w:r>
-        <w:t xml:space="preserve"> </w:t>
-      </w:r>
-      <w:r>
-        <w:t xml:space="preserve">The series is not seasonally adjusted, so the quarter-on-quarter change mostly reflects the season. The report prints it with a marker and does not interpret it.</w:t>
+        <w:t xml:space="preserve">The supply pipeline has the opposite sign to the supply argument.</w:t>
+      </w:r>
+      <w:r>
+        <w:t xml:space="preserve"> </w:t>
+      </w:r>
+      <w:r>
+        <w:t xml:space="preserve">Developers launch when the market is strong, so at horizons up to two years the pipeline reflects current conditions. I keep it in the report as a monitored series but do not read a direction from it.</w:t>
       </w:r>
     </w:p>
     <w:p>
@@ -1035,13 +803,13 @@
           <w:bCs/>
           <w:b/>
         </w:rPr>
-        <w:t xml:space="preserve">Vacancy rate is derived.</w:t>
-      </w:r>
-      <w:r>
-        <w:t xml:space="preserve"> </w:t>
-      </w:r>
-      <w:r>
-        <w:t xml:space="preserve">URA publishes vacant units and available units; the workflow divides them and shows the division in the report.</w:t>
+        <w:t xml:space="preserve">SORA is not significant, but its history starts in 2005.</w:t>
+      </w:r>
+      <w:r>
+        <w:t xml:space="preserve"> </w:t>
+      </w:r>
+      <w:r>
+        <w:t xml:space="preserve">With 75 quarters the test has little power. I keep it because it is the reference rate for home loans, and label it as resting on economic reasoning only.</w:t>
       </w:r>
     </w:p>
     <w:p>
@@ -1049,7 +817,17 @@
         <w:pStyle w:val="FirstParagraph"/>
       </w:pPr>
       <w:r>
-        <w:t xml:space="preserve">All seven come from the SingStat Table Builder API, which republishes agency series with uniform metadata (unit, frequency, last-updated date). That keeps one parser and one validation path, at the cost of a single point of failure, discussed in Section 6.</w:t>
+        <w:rPr>
+          <w:bCs/>
+          <w:b/>
+        </w:rPr>
+        <w:t xml:space="preserve">Final list.</w:t>
+      </w:r>
+      <w:r>
+        <w:t xml:space="preserve"> </w:t>
+      </w:r>
+      <w:r>
+        <w:t xml:space="preserve">Six factors: vacancy rate, nominal GDP, HDB resale price index, resident unemployment rate, supply pipeline (monitored only) and 3-month SORA. CPI and population were dropped. A factor is read for a market only where the screening supports it, and the report shows the evidence tier (strict, lead or prior) beside every reading. For each factor the report also gives the source and link, definition, unit, observation and update frequency, latest observation, possible time lag and limitations.</w:t>
       </w:r>
     </w:p>
     <w:bookmarkEnd w:id="21"/>
@@ -1167,7 +945,7 @@
               <w:rPr>
                 <w:sz w:val="18"/>
               </w:rPr>
-              <w:t xml:space="preserve">HTTP GET per indicator, three attempts with backoff for timeouts, 5xx and 429</w:t>
+              <w:t xml:space="preserve">HTTP GET per series, three attempts with backoff for timeouts, 5xx and 429</w:t>
             </w:r>
           </w:p>
         </w:tc>
@@ -1217,7 +995,7 @@
               <w:rPr>
                 <w:sz w:val="18"/>
               </w:rPr>
-              <w:t xml:space="preserve">Select the series by number and row text; check frequency and unit against the registry; parse period keys; record non-numeric values</w:t>
+              <w:t xml:space="preserve">Select the series by number and row text; check frequency and unit against the registry; parse period keys</w:t>
             </w:r>
           </w:p>
         </w:tc>
@@ -1267,7 +1045,7 @@
               <w:rPr>
                 <w:sz w:val="18"/>
               </w:rPr>
-              <w:t xml:space="preserve">Choose the latest observation usable at the report date; compute changes; check staleness, gaps, plausible range, revisions</w:t>
+              <w:t xml:space="preserve">Latest observation usable at the report date; changes; staleness, gaps, plausible range, revisions</w:t>
             </w:r>
           </w:p>
         </w:tc>
@@ -1301,56 +1079,6 @@
               <w:rPr>
                 <w:sz w:val="18"/>
               </w:rPr>
-              <w:t xml:space="preserve">Narrate</w:t>
-            </w:r>
-          </w:p>
-        </w:tc>
-        <w:tc>
-          <w:tcPr/>
-          <w:p>
-            <w:pPr>
-              <w:pStyle w:val="Compact"/>
-              <w:spacing w:after="20"/>
-              <w:jc w:val="left"/>
-            </w:pPr>
-            <w:r>
-              <w:rPr>
-                <w:sz w:val="18"/>
-              </w:rPr>
-              <w:t xml:space="preserve">Rule-based directional reading per indicator and market; optional LLM paragraph</w:t>
-            </w:r>
-          </w:p>
-        </w:tc>
-        <w:tc>
-          <w:tcPr/>
-          <w:p>
-            <w:pPr>
-              <w:pStyle w:val="Compact"/>
-              <w:spacing w:after="20"/>
-              <w:jc w:val="left"/>
-            </w:pPr>
-            <w:r>
-              <w:rPr>
-                <w:sz w:val="18"/>
-              </w:rPr>
-              <w:t xml:space="preserve">Commentary and its provenance</w:t>
-            </w:r>
-          </w:p>
-        </w:tc>
-      </w:tr>
-      <w:tr>
-        <w:tc>
-          <w:tcPr/>
-          <w:p>
-            <w:pPr>
-              <w:pStyle w:val="Compact"/>
-              <w:spacing w:after="20"/>
-              <w:jc w:val="left"/>
-            </w:pPr>
-            <w:r>
-              <w:rPr>
-                <w:sz w:val="18"/>
-              </w:rPr>
               <w:t xml:space="preserve">Report</w:t>
             </w:r>
           </w:p>
@@ -1443,7 +1171,7 @@
         <w:t xml:space="preserve"> </w:t>
       </w:r>
       <w:r>
-        <w:t xml:space="preserve">Everything known about a series (table, row, unit, frequency, expected publication lag, plausible range, sign, rationale) is in</w:t>
+        <w:t xml:space="preserve">Everything known about a series (table, row, unit, frequencies, expected lag, sign, evidence, rationale) is in</w:t>
       </w:r>
       <w:r>
         <w:t xml:space="preserve"> </w:t>
@@ -1455,7 +1183,7 @@
         <w:t xml:space="preserve">config/indicators.yaml</w:t>
       </w:r>
       <w:r>
-        <w:t xml:space="preserve">. Adding an indicator is a configuration change.</w:t>
+        <w:t xml:space="preserve">. Changing the factor list after the screening was a configuration change, with no change to the pipeline code.</w:t>
       </w:r>
     </w:p>
     <w:p>
@@ -1467,13 +1195,13 @@
           <w:bCs/>
           <w:b/>
         </w:rPr>
-        <w:t xml:space="preserve">Units.</w:t>
-      </w:r>
-      <w:r>
-        <w:t xml:space="preserve"> </w:t>
-      </w:r>
-      <w:r>
-        <w:t xml:space="preserve">Each indicator declares how its change is expressed: interest rates in basis points, rates and shares in percentage points, indices and levels in per cent. This is tested directly.</w:t>
+        <w:t xml:space="preserve">Units and changes.</w:t>
+      </w:r>
+      <w:r>
+        <w:t xml:space="preserve"> </w:t>
+      </w:r>
+      <w:r>
+        <w:t xml:space="preserve">Interest rates change in basis points, rates and shares in percentage points, indices and levels in per cent. A change is computed by looking up the exact comparison period; if that period is missing, the change is shown as unavailable instead of comparing against the wrong one.</w:t>
       </w:r>
     </w:p>
     <w:p>
@@ -1485,31 +1213,43 @@
           <w:bCs/>
           <w:b/>
         </w:rPr>
-        <w:t xml:space="preserve">Changes are looked up by period, not by position.</w:t>
-      </w:r>
-      <w:r>
-        <w:t xml:space="preserve"> </w:t>
-      </w:r>
-      <w:r>
-        <w:t xml:space="preserve">The month-on-month change for August looks up July. If July is absent the change is reported as unavailable. Taking</w:t>
-      </w:r>
-      <w:r>
-        <w:t xml:space="preserve"> </w:t>
-      </w:r>
-      <w:r>
-        <w:t xml:space="preserve">“</w:t>
-      </w:r>
-      <w:r>
-        <w:t xml:space="preserve">the previous row</w:t>
-      </w:r>
-      <w:r>
-        <w:t xml:space="preserve">”</w:t>
-      </w:r>
-      <w:r>
-        <w:t xml:space="preserve"> </w:t>
-      </w:r>
-      <w:r>
-        <w:t xml:space="preserve">would silently compare August with June.</w:t>
+        <w:t xml:space="preserve">Traceability and reproducibility.</w:t>
+      </w:r>
+      <w:r>
+        <w:t xml:space="preserve"> </w:t>
+      </w:r>
+      <w:r>
+        <w:t xml:space="preserve">For each figure the report prints the calculation with the published values and the snapshot file and checksum, for example: year-on-year −37.8 bp = (1.1863 − 1.5638) × 100.</w:t>
+      </w:r>
+      <w:r>
+        <w:t xml:space="preserve"> </w:t>
+      </w:r>
+      <w:r>
+        <w:rPr>
+          <w:rStyle w:val="VerbatimChar"/>
+        </w:rPr>
+        <w:t xml:space="preserve">manifest.json</w:t>
+      </w:r>
+      <w:r>
+        <w:t xml:space="preserve"> </w:t>
+      </w:r>
+      <w:r>
+        <w:t xml:space="preserve">records which snapshots produced a report, and</w:t>
+      </w:r>
+      <w:r>
+        <w:t xml:space="preserve"> </w:t>
+      </w:r>
+      <w:r>
+        <w:rPr>
+          <w:rStyle w:val="VerbatimChar"/>
+        </w:rPr>
+        <w:t xml:space="preserve">--from-manifest</w:t>
+      </w:r>
+      <w:r>
+        <w:t xml:space="preserve"> </w:t>
+      </w:r>
+      <w:r>
+        <w:t xml:space="preserve">rebuilds it from exactly those files. A test confirms the rebuilt report is byte-identical even after newer, revised data has been downloaded. Running the same request twice adds new snapshots and never alters old ones.</w:t>
       </w:r>
     </w:p>
     <w:p>
@@ -1521,25 +1261,13 @@
           <w:bCs/>
           <w:b/>
         </w:rPr>
-        <w:t xml:space="preserve">Traceability.</w:t>
-      </w:r>
-      <w:r>
-        <w:t xml:space="preserve"> </w:t>
-      </w:r>
-      <w:r>
-        <w:t xml:space="preserve">For each figure the report prints the calculation with the published values and the snapshot file and checksum, for example: year-on-year −37.8 bp = (1.1863 − 1.5638) × 100, from 2026 Aug = 1.1863 and 2025 Aug = 1.5638.</w:t>
-      </w:r>
-    </w:p>
-    <w:p>
-      <w:pPr>
-        <w:pStyle w:val="BodyText"/>
-      </w:pPr>
-      <w:r>
-        <w:rPr>
-          <w:bCs/>
-          <w:b/>
-        </w:rPr>
-        <w:t xml:space="preserve">Reproducibility.</w:t>
+        <w:t xml:space="preserve">Where the LLM sits.</w:t>
+      </w:r>
+      <w:r>
+        <w:t xml:space="preserve"> </w:t>
+      </w:r>
+      <w:r>
+        <w:t xml:space="preserve">No figure comes from a model. The directional readings are computed by rule. With</w:t>
       </w:r>
       <w:r>
         <w:t xml:space="preserve"> </w:t>
@@ -1548,58 +1276,10 @@
         <w:rPr>
           <w:rStyle w:val="VerbatimChar"/>
         </w:rPr>
-        <w:t xml:space="preserve">manifest.json</w:t>
-      </w:r>
-      <w:r>
-        <w:t xml:space="preserve"> </w:t>
-      </w:r>
-      <w:r>
-        <w:t xml:space="preserve">records which snapshots produced a report.</w:t>
-      </w:r>
-      <w:r>
-        <w:t xml:space="preserve"> </w:t>
-      </w:r>
-      <w:r>
-        <w:rPr>
-          <w:rStyle w:val="VerbatimChar"/>
-        </w:rPr>
-        <w:t xml:space="preserve">--from-manifest</w:t>
-      </w:r>
-      <w:r>
-        <w:t xml:space="preserve"> </w:t>
-      </w:r>
-      <w:r>
-        <w:t xml:space="preserve">rebuilds the report from exactly those files, verified by checksum, without network. A test confirms the rebuilt report is byte-identical even after newer, revised data has been downloaded.</w:t>
-      </w:r>
-    </w:p>
-    <w:p>
-      <w:pPr>
-        <w:pStyle w:val="BodyText"/>
-      </w:pPr>
-      <w:r>
-        <w:rPr>
-          <w:bCs/>
-          <w:b/>
-        </w:rPr>
-        <w:t xml:space="preserve">Where the LLM sits.</w:t>
-      </w:r>
-      <w:r>
-        <w:t xml:space="preserve"> </w:t>
-      </w:r>
-      <w:r>
-        <w:t xml:space="preserve">No figure in the report comes from a model. The directional readings are computed by rule. With</w:t>
-      </w:r>
-      <w:r>
-        <w:t xml:space="preserve"> </w:t>
-      </w:r>
-      <w:r>
-        <w:rPr>
-          <w:rStyle w:val="VerbatimChar"/>
-        </w:rPr>
         <w:t xml:space="preserve">--llm</w:t>
       </w:r>
       <w:r>
-        <w:t xml:space="preserve">, a model rewrites those readings into one paragraph per market. The text is accepted only if every number in it also appears in the computed facts; otherwise the rule-based paragraph is used and the rejection is recorded in the report. I chose this because the valuable property of the report is that its numbers can be trusted, and an unconstrained model weakens that. The submitted sample report was produced without an API key, so its commentary is rule-based.</w:t>
+        <w:t xml:space="preserve">, a model writes a short commentary from those readings, and the text is accepted only if every number in it also appears in the computed facts; otherwise it is dropped and the rejection is recorded in the report. I chose this because the value of the report is that its numbers can be trusted. The submitted sample report was produced without an API key and therefore contains no LLM text.</w:t>
       </w:r>
     </w:p>
     <w:bookmarkEnd w:id="22"/>
@@ -1751,7 +1431,7 @@
               <w:rPr>
                 <w:sz w:val="18"/>
               </w:rPr>
-              <w:t xml:space="preserve">No data at all for an indicator</w:t>
+              <w:t xml:space="preserve">No data at all for a factor</w:t>
             </w:r>
           </w:p>
         </w:tc>
@@ -1801,7 +1481,7 @@
               <w:rPr>
                 <w:sz w:val="18"/>
               </w:rPr>
-              <w:t xml:space="preserve">Series is matched on row text as well as number; a mismatch is an error that lists the rows returned</w:t>
+              <w:t xml:space="preserve">Series is matched on row text as well as number; a mismatch is an error listing the rows returned</w:t>
             </w:r>
           </w:p>
         </w:tc>
@@ -1835,7 +1515,7 @@
               <w:rPr>
                 <w:sz w:val="18"/>
               </w:rPr>
-              <w:t xml:space="preserve">Fatal for that indicator, since every computed change would otherwise be wrong without any visible sign</w:t>
+              <w:t xml:space="preserve">Fatal for that factor, since every change would otherwise be silently wrong</w:t>
             </w:r>
           </w:p>
         </w:tc>
@@ -1903,7 +1583,7 @@
               <w:rPr>
                 <w:sz w:val="18"/>
               </w:rPr>
-              <w:t xml:space="preserve">Each indicator has a maximum expected age; older data is flagged STALE in the summary table</w:t>
+              <w:t xml:space="preserve">Each factor has a maximum expected age; older data is marked STALE in the summary table</w:t>
             </w:r>
           </w:p>
         </w:tc>
@@ -1977,62 +1657,6 @@
         </w:tc>
       </w:tr>
     </w:tbl>
-    <w:p>
-      <w:pPr>
-        <w:pStyle w:val="BodyText"/>
-      </w:pPr>
-      <w:r>
-        <w:t xml:space="preserve">A report is always written and the exit code distinguishes</w:t>
-      </w:r>
-      <w:r>
-        <w:t xml:space="preserve"> </w:t>
-      </w:r>
-      <w:r>
-        <w:t xml:space="preserve">“</w:t>
-      </w:r>
-      <w:r>
-        <w:t xml:space="preserve">current</w:t>
-      </w:r>
-      <w:r>
-        <w:t xml:space="preserve">”</w:t>
-      </w:r>
-      <w:r>
-        <w:t xml:space="preserve">,</w:t>
-      </w:r>
-      <w:r>
-        <w:t xml:space="preserve"> </w:t>
-      </w:r>
-      <w:r>
-        <w:t xml:space="preserve">“</w:t>
-      </w:r>
-      <w:r>
-        <w:t xml:space="preserve">degraded</w:t>
-      </w:r>
-      <w:r>
-        <w:t xml:space="preserve">”</w:t>
-      </w:r>
-      <w:r>
-        <w:t xml:space="preserve"> </w:t>
-      </w:r>
-      <w:r>
-        <w:t xml:space="preserve">and</w:t>
-      </w:r>
-      <w:r>
-        <w:t xml:space="preserve"> </w:t>
-      </w:r>
-      <w:r>
-        <w:t xml:space="preserve">“</w:t>
-      </w:r>
-      <w:r>
-        <w:t xml:space="preserve">incomplete</w:t>
-      </w:r>
-      <w:r>
-        <w:t xml:space="preserve">”</w:t>
-      </w:r>
-      <w:r>
-        <w:t xml:space="preserve">, so a scheduler can alert while a reader still sees what is missing.</w:t>
-      </w:r>
-    </w:p>
     <w:bookmarkEnd w:id="23"/>
     <w:bookmarkStart w:id="24" w:name="testing-a-failure-and-the-fix"/>
     <w:p>
@@ -2048,7 +1672,7 @@
         <w:pStyle w:val="FirstParagraph"/>
       </w:pPr>
       <w:r>
-        <w:t xml:space="preserve">The 22 tests use payloads with the real API structure and a fake HTTP session. They cover period parsing, unit handling, as-of selection, each row of the table in Section 4, byte-identical reproduction, and the LLM number check.</w:t>
+        <w:t xml:space="preserve">The 33 tests use payloads with the real API structure and a fake HTTP session. They cover parsing, unit handling, as-of selection, every row of the table above, byte-identical reproduction, the LLM number check, and the econometrics on simulated data where the right answer is known (a planted leading factor passes, noise does not, and a factor that only echoes past growth passes the lead test but fails the strict one).</w:t>
       </w:r>
     </w:p>
     <w:p>
@@ -2066,53 +1690,7 @@
         <w:t xml:space="preserve"> </w:t>
       </w:r>
       <w:r>
-        <w:t xml:space="preserve">The tests passed, but the first run against the real API returned exit code 2 with SORA unavailable. The SORA row was selected by a keyword pattern. The live table contains both overnight SORA (series 21) and 3-month compounded SORA (series 23), so two rows matched. The workflow refused to guess and printed the rows it received:</w:t>
-      </w:r>
-    </w:p>
-    <w:p>
-      <w:pPr>
-        <w:pStyle w:val="SourceCode"/>
-      </w:pPr>
-      <w:r>
-        <w:rPr>
-          <w:rStyle w:val="VerbatimChar"/>
-          <w:sz w:val="17"/>
-        </w:rPr>
-        <w:t xml:space="preserve">UNAVAILABLE sora  downloaded payload rejected: 2 rows match ... Rows returned: ...</w:t>
-      </w:r>
-      <w:r>
-        <w:rPr>
-          <w:sz w:val="17"/>
-        </w:rPr>
-        <w:br/>
-      </w:r>
-      <w:r>
-        <w:rPr>
-          <w:rStyle w:val="VerbatimChar"/>
-          <w:sz w:val="17"/>
-        </w:rPr>
-        <w:t xml:space="preserve">21='Singapore Overnight Rate Average';</w:t>
-      </w:r>
-      <w:r>
-        <w:rPr>
-          <w:sz w:val="17"/>
-        </w:rPr>
-        <w:br/>
-      </w:r>
-      <w:r>
-        <w:rPr>
-          <w:rStyle w:val="VerbatimChar"/>
-          <w:sz w:val="17"/>
-        </w:rPr>
-        <w:t xml:space="preserve">23='Compounded Singapore Overnight Rate Average (SORA) - 3 Month'</w:t>
-      </w:r>
-    </w:p>
-    <w:p>
-      <w:pPr>
-        <w:pStyle w:val="FirstParagraph"/>
-      </w:pPr>
-      <w:r>
-        <w:t xml:space="preserve">Two things follow. First, the guard did its job: picking the first match would have produced a plausible number from the wrong series. Second, the cause was a test fixture that was simpler than reality, with only one SORA row. The fix was to select series 23 with an exact text match, because the compounded rate is the one home loans reference, and to add the second row to the fixture so the ambiguity is now exercised by the tests. The second run returned all seven indicators with exit code 0. Both steps are in the commit history.</w:t>
+        <w:t xml:space="preserve">The tests passed, but the first run against the real API returned exit code 2 with SORA unavailable. The SORA row was selected by a keyword pattern, and the live table contains both overnight SORA (series 21) and 3-month compounded SORA (series 23), so two rows matched. The workflow refused to guess and printed the rows it received. The guard did its job: taking the first match would have produced a plausible number from the wrong series. The cause was a test fixture simpler than reality. The fix was to select series 23 with an exact text match, since the compounded rate is the one home loans reference, and to add the second row to the fixture. Both steps are in the commit history.</w:t>
       </w:r>
     </w:p>
     <w:p>
@@ -2124,7 +1702,7 @@
           <w:bCs/>
           <w:b/>
         </w:rPr>
-        <w:t xml:space="preserve">A second issue found during development.</w:t>
+        <w:t xml:space="preserve">A second issue.</w:t>
       </w:r>
       <w:r>
         <w:t xml:space="preserve"> </w:t>
@@ -2145,22 +1723,7 @@
         <w:t xml:space="preserve"> </w:t>
       </w:r>
       <w:r>
-        <w:t xml:space="preserve">parameter counts cells across all rows of a table, not periods per series. For a table with many rows this truncates each series to a few periods, which would leave too little history for a year-on-year change. The request therefore filters to the one series needed; the live run returned full history (for example 788 monthly CPI observations from 1961). If history is ever short, the change is reported as unavailable and a</w:t>
-      </w:r>
-      <w:r>
-        <w:t xml:space="preserve"> </w:t>
-      </w:r>
-      <w:r>
-        <w:rPr>
-          <w:rStyle w:val="VerbatimChar"/>
-        </w:rPr>
-        <w:t xml:space="preserve">short_history</w:t>
-      </w:r>
-      <w:r>
-        <w:t xml:space="preserve"> </w:t>
-      </w:r>
-      <w:r>
-        <w:t xml:space="preserve">warning is logged, which is also tested.</w:t>
+        <w:t xml:space="preserve">parameter counts cells across all rows of a table, not periods per series, which can truncate history. Requests therefore filter to the one series needed. One candidate, the USD exchange rate, was configured without a series number and came back too short to test; the screening reports it as not tested instead of testing it on a truncated sample.</w:t>
       </w:r>
     </w:p>
     <w:p>
@@ -2172,23 +1735,23 @@
           <w:bCs/>
           <w:b/>
         </w:rPr>
-        <w:t xml:space="preserve">Result of the live run, 4 October 2026.</w:t>
-      </w:r>
-      <w:r>
-        <w:t xml:space="preserve"> </w:t>
-      </w:r>
-      <w:r>
-        <w:t xml:space="preserve">Five of seven indicators read as upward pressure on sale prices (lower SORA, higher CPI, GDP and population, lower vacancy) and two as downward (higher resident unemployment, larger supply pipeline). For rents, four of six read as upward. These are directional readings, not a forecast.</w:t>
+        <w:t xml:space="preserve">Live result, 4 October 2026.</w:t>
+      </w:r>
+      <w:r>
+        <w:t xml:space="preserve"> </w:t>
+      </w:r>
+      <w:r>
+        <w:t xml:space="preserve">For sale prices three of four factors read as upward pressure (lower vacancy, higher GDP, lower SORA) and the HDB index is flat. For rents two of three read as upward (lower vacancy, higher GDP) and one as downward (higher unemployment). These are directional readings, not a forecast.</w:t>
       </w:r>
     </w:p>
     <w:bookmarkEnd w:id="24"/>
-    <w:bookmarkStart w:id="25" w:name="limitations-and-next-steps"/>
+    <w:bookmarkStart w:id="25" w:name="X369ff30b045b34228ab639fe1f124013939723d"/>
     <w:p>
       <w:pPr>
         <w:pStyle w:val="Heading1"/>
       </w:pPr>
       <w:r>
-        <w:t xml:space="preserve">6. Limitations and next steps</w:t>
+        <w:t xml:space="preserve">6. Limitations, and what I would build with two more weeks</w:t>
       </w:r>
     </w:p>
     <w:p>
@@ -2204,13 +1767,29 @@
           <w:bCs/>
           <w:b/>
         </w:rPr>
-        <w:t xml:space="preserve">Single upstream API.</w:t>
-      </w:r>
-      <w:r>
-        <w:t xml:space="preserve"> </w:t>
-      </w:r>
-      <w:r>
-        <w:t xml:space="preserve">A change to the SingStat interface affects all indicators at once. Snapshots keep past reports reproducible but not current. Next step: a second route per series, such as data.gov.sg or the agency’s own API.</w:t>
+        <w:t xml:space="preserve">Screening limits.</w:t>
+      </w:r>
+      <w:r>
+        <w:t xml:space="preserve"> </w:t>
+      </w:r>
+      <w:r>
+        <w:t xml:space="preserve">Small samples, today’s data vintage instead of real-time data, no publication lags, and no treatment of cooling measures.</w:t>
+      </w:r>
+      <w:r>
+        <w:t xml:space="preserve"> </w:t>
+      </w:r>
+      <w:r>
+        <w:rPr>
+          <w:iCs/>
+          <w:i/>
+        </w:rPr>
+        <w:t xml:space="preserve">Next:</w:t>
+      </w:r>
+      <w:r>
+        <w:t xml:space="preserve"> </w:t>
+      </w:r>
+      <w:r>
+        <w:t xml:space="preserve">add policy dummies for the cooling-measure rounds, and test horizons beyond eight quarters so the supply pipeline can be assessed at the horizon where it should matter.</w:t>
       </w:r>
     </w:p>
     <w:p>
@@ -2226,13 +1805,29 @@
           <w:bCs/>
           <w:b/>
         </w:rPr>
-        <w:t xml:space="preserve">Back-dated reports are approximate.</w:t>
-      </w:r>
-      <w:r>
-        <w:t xml:space="preserve"> </w:t>
-      </w:r>
-      <w:r>
-        <w:t xml:space="preserve">They use today’s vintage with a publication-lag rule. True point-in-time data exists only for dates on which a snapshot was taken, so the workflow should run on a schedule to build that archive.</w:t>
+        <w:t xml:space="preserve">Single upstream API.</w:t>
+      </w:r>
+      <w:r>
+        <w:t xml:space="preserve"> </w:t>
+      </w:r>
+      <w:r>
+        <w:t xml:space="preserve">A change to the SingStat interface affects all factors at once.</w:t>
+      </w:r>
+      <w:r>
+        <w:t xml:space="preserve"> </w:t>
+      </w:r>
+      <w:r>
+        <w:rPr>
+          <w:iCs/>
+          <w:i/>
+        </w:rPr>
+        <w:t xml:space="preserve">Next:</w:t>
+      </w:r>
+      <w:r>
+        <w:t xml:space="preserve"> </w:t>
+      </w:r>
+      <w:r>
+        <w:t xml:space="preserve">a second route per series through data.gov.sg or the agency’s own API.</w:t>
       </w:r>
     </w:p>
     <w:p>
@@ -2248,13 +1843,29 @@
           <w:bCs/>
           <w:b/>
         </w:rPr>
-        <w:t xml:space="preserve">Signs are judgements.</w:t>
-      </w:r>
-      <w:r>
-        <w:t xml:space="preserve"> </w:t>
-      </w:r>
-      <w:r>
-        <w:t xml:space="preserve">They are not estimated, and lags differ by indicator. Next step: check each sign and lag against the URA price and rental indices.</w:t>
+        <w:t xml:space="preserve">Back-dated reports are approximate.</w:t>
+      </w:r>
+      <w:r>
+        <w:t xml:space="preserve"> </w:t>
+      </w:r>
+      <w:r>
+        <w:t xml:space="preserve">True point-in-time data exists only for dates on which a snapshot was taken.</w:t>
+      </w:r>
+      <w:r>
+        <w:t xml:space="preserve"> </w:t>
+      </w:r>
+      <w:r>
+        <w:rPr>
+          <w:iCs/>
+          <w:i/>
+        </w:rPr>
+        <w:t xml:space="preserve">Next:</w:t>
+      </w:r>
+      <w:r>
+        <w:t xml:space="preserve"> </w:t>
+      </w:r>
+      <w:r>
+        <w:t xml:space="preserve">run on a schedule to build that archive, then repeat the screening on real-time vintages.</w:t>
       </w:r>
     </w:p>
     <w:p>
@@ -2276,7 +1887,23 @@
         <w:t xml:space="preserve"> </w:t>
       </w:r>
       <w:r>
-        <w:t xml:space="preserve">No HDB supply series and no household income series are included.</w:t>
+        <w:t xml:space="preserve">Private housing only on the target side, and no household income or transaction-volume series.</w:t>
+      </w:r>
+      <w:r>
+        <w:t xml:space="preserve"> </w:t>
+      </w:r>
+      <w:r>
+        <w:rPr>
+          <w:iCs/>
+          <w:i/>
+        </w:rPr>
+        <w:t xml:space="preserve">Next:</w:t>
+      </w:r>
+      <w:r>
+        <w:t xml:space="preserve"> </w:t>
+      </w:r>
+      <w:r>
+        <w:t xml:space="preserve">add the HDB resale index as a third target and the missing candidates.</w:t>
       </w:r>
     </w:p>
     <w:p>
@@ -2298,7 +1925,45 @@
         <w:t xml:space="preserve"> </w:t>
       </w:r>
       <w:r>
-        <w:t xml:space="preserve">It stops invented figures but not a misleading sentence that uses correct ones.</w:t>
+        <w:t xml:space="preserve">It stops invented figures but not a misleading sentence built from correct ones.</w:t>
+      </w:r>
+      <w:r>
+        <w:t xml:space="preserve"> </w:t>
+      </w:r>
+      <w:r>
+        <w:rPr>
+          <w:iCs/>
+          <w:i/>
+        </w:rPr>
+        <w:t xml:space="preserve">Next:</w:t>
+      </w:r>
+      <w:r>
+        <w:t xml:space="preserve"> </w:t>
+      </w:r>
+      <w:r>
+        <w:t xml:space="preserve">check each sentence’s direction against the computed reading.</w:t>
+      </w:r>
+    </w:p>
+    <w:p>
+      <w:pPr>
+        <w:numPr>
+          <w:ilvl w:val="0"/>
+          <w:numId w:val="1002"/>
+        </w:numPr>
+        <w:pStyle w:val="Compact"/>
+      </w:pPr>
+      <w:r>
+        <w:rPr>
+          <w:bCs/>
+          <w:b/>
+        </w:rPr>
+        <w:t xml:space="preserve">Not pursued.</w:t>
+      </w:r>
+      <w:r>
+        <w:t xml:space="preserve"> </w:t>
+      </w:r>
+      <w:r>
+        <w:t xml:space="preserve">ARIMA enters only as the autoregressive benchmark in the strict test. GARCH models volatility, which is not what the task asks about, and a smoothed quarterly index of about 150 observations gives it little to work with.</w:t>
       </w:r>
     </w:p>
     <w:bookmarkEnd w:id="25"/>
@@ -2338,7 +2003,7 @@
         <w:t xml:space="preserve"> </w:t>
       </w:r>
       <w:r>
-        <w:t xml:space="preserve">proposing the indicator set and its rationale; writing the Python modules, the tests, the README and the first draft of this report; looking up SingStat table identifiers and checking the API response format; diagnosing the SORA failure from the output I sent it and making the fix; preparing the initial commit history.</w:t>
+        <w:t xml:space="preserve">proposing the candidate pool and rationale; writing the Python modules, the tests, the README and the first draft of this report; looking up SingStat table identifiers; implementing the screening regressions; diagnosing the SORA failure from the output I sent it and making the fix; preparing the initial commit history.</w:t>
       </w:r>
     </w:p>
     <w:p>
@@ -2360,7 +2025,7 @@
         <w:t xml:space="preserve"> </w:t>
       </w:r>
       <w:r>
-        <w:t xml:space="preserve">setting the scope and constraints, running the tests and the live workflow on my own machine, reporting the results back, committing the fix and the sample data, and reviewing the indicator choices, signs and wording.</w:t>
+        <w:t xml:space="preserve">setting the direction (asking for an econometric screening, choosing the six-factor list from its results, deciding the report layout), running every test and live run on my own machine, reporting the results back, and committing each step.</w:t>
       </w:r>
     </w:p>
     <w:p>
@@ -2382,7 +2047,7 @@
         <w:t xml:space="preserve"> </w:t>
       </w:r>
       <w:r>
-        <w:t xml:space="preserve">all 22 tests pass on my machine; the live run was repeated after the fix and returned exit code 0; figures in the sample report were compared with the values shown on the SingStat website for the same series and period; the calculation column in the report was recomputed by hand for a sample of figures.</w:t>
+        <w:t xml:space="preserve">all 33 tests pass on my machine; the live run was repeated after the fix and returned exit code 0; three figures in the sample report were compared with the SingStat website; the update schedule stated for every factor was checked against the agencies’ 2026 Q2 release dates (14 July, 24 July, 31 July, 11 August and 23 September); the screening output was read line by line against the factor list.</w:t>
       </w:r>
     </w:p>
     <w:p>

</xml_diff>

<commit_message>
Fix manifest reproduction to pin the exact snapshot file; update test count
</commit_message>
<xml_diff>
--- a/docs/Summary Report.docx
+++ b/docs/Summary Report.docx
@@ -127,7 +127,7 @@
         <w:pStyle w:val="FirstParagraph"/>
       </w:pPr>
       <w:r>
-        <w:t xml:space="preserve">No forecasting model is trained. I treated the task as two questions: which few series are worth watching and on what evidence, and how to make the path from the publisher to the report reliable and reproducible. The repository contains the code, 33 tests that run without network, the raw snapshots from a live run on 4 October 2026, the report that run produced, and the factor screening output.</w:t>
+        <w:t xml:space="preserve">No forecasting model is trained. I treated the task as two questions: which few series are worth watching and on what evidence, and how to make the path from the publisher to the report reliable and reproducible. The repository contains the code, 34 tests that run without network, the raw snapshots from a live run on 4 October 2026, the report that run produced, and the factor screening output.</w:t>
       </w:r>
     </w:p>
     <w:bookmarkEnd w:id="20"/>
@@ -1672,7 +1672,7 @@
         <w:pStyle w:val="FirstParagraph"/>
       </w:pPr>
       <w:r>
-        <w:t xml:space="preserve">The 33 tests use payloads with the real API structure and a fake HTTP session. They cover parsing, unit handling, as-of selection, every row of the table above, byte-identical reproduction, the LLM number check, and the econometrics on simulated data where the right answer is known (a planted leading factor passes, noise does not, and a factor that only echoes past growth passes the lead test but fails the strict one).</w:t>
+        <w:t xml:space="preserve">The 34 tests use payloads with the real API structure and a fake HTTP session. They cover parsing, unit handling, as-of selection, every row of the table above, byte-identical reproduction, the LLM number check, and the econometrics on simulated data where the right answer is known (a planted leading factor passes, noise does not, and a factor that only echoes past growth passes the lead test but fails the strict one).</w:t>
       </w:r>
     </w:p>
     <w:p>
@@ -2047,7 +2047,7 @@
         <w:t xml:space="preserve"> </w:t>
       </w:r>
       <w:r>
-        <w:t xml:space="preserve">all 33 tests pass on my machine; the live run was repeated after the fix and returned exit code 0; three figures in the sample report were compared with the SingStat website; the update schedule stated for every factor was checked against the agencies’ 2026 Q2 release dates (14 July, 24 July, 31 July, 11 August and 23 September); the screening output was read line by line against the factor list.</w:t>
+        <w:t xml:space="preserve">all 34 tests pass on my machine; the live run was repeated after the fix and returned exit code 0; three figures in the sample report were compared with the SingStat website; the update schedule stated for every factor was checked against the agencies’ 2026 Q2 release dates (14 July, 24 July, 31 July, 11 August and 23 September); the screening output was read line by line against the factor list.</w:t>
       </w:r>
     </w:p>
     <w:p>

</xml_diff>